<commit_message>
harden flatten stage1 SDC cleanup
</commit_message>
<xml_diff>
--- a/soc_sdc_work/Flatten SDC脚本/STA Flatten 1 Harden DC SDC Clean 脚本/Harden_DC_SDC_to_SoC_SDC_v2.3.1_final.docx
+++ b/soc_sdc_work/Flatten SDC脚本/STA Flatten 1 Harden DC SDC Clean 脚本/Harden_DC_SDC_to_SoC_SDC_v2.3.1_final.docx
@@ -391,7 +391,7 @@
           <w:rFonts w:ascii="Courier New" w:hAnsi="Courier New" w:eastAsia="Courier New"/>
           <w:sz w:val="17"/>
         </w:rPr>
-        <w:t>python proc_harden_sdc.py \</w:t>
+        <w:t>python run_stage1_clean_sdc.py \</w:t>
       </w:r>
     </w:p>
     <w:p>
@@ -1913,7 +1913,7 @@
     </w:p>
     <w:p>
       <w:r>
-        <w:t>脚本启动时需要检查输入文件是否已被处理过。v2.1+ 主 SDC 不再包含 SOC_STRIP 注释，因此幂等检测应主要依赖 generated header signature、tool metadata、output file marker、version tag。SOC_STRIP( 仅用于识别旧 v2.0 输出或历史中间文件。</w:t>
+        <w:t>脚本启动时需要检查输入文件是否为 Stage1 自身产物。幂等检测只检查输入顶部 preamble，并依赖 Stage1 专属 generated header 或 tool metadata；只识别 run_stage1_clean_sdc.py，并兼容旧名 proc_harden_sdc.py。不得仅凭通用的 SDC_PROCESS_VERSION、Stage2 文件头或其它流程版本字段判定输入已被 Stage1 处理。</w:t>
       </w:r>
     </w:p>
     <w:p>
@@ -1921,10 +1921,6 @@
         <w:pStyle w:val="CodeBlock"/>
       </w:pPr>
       <w:r>
-        <w:rPr>
-          <w:rFonts w:ascii="Courier New" w:hAnsi="Courier New" w:eastAsia="Courier New"/>
-          <w:sz w:val="17"/>
-        </w:rPr>
         <w:t>Auto-generated SoC-callable harden SDC</w:t>
       </w:r>
     </w:p>
@@ -1933,11 +1929,7 @@
         <w:pStyle w:val="CodeBlock"/>
       </w:pPr>
       <w:r>
-        <w:rPr>
-          <w:rFonts w:ascii="Courier New" w:hAnsi="Courier New" w:eastAsia="Courier New"/>
-          <w:sz w:val="17"/>
-        </w:rPr>
-        <w:t>Generated by: proc_harden_sdc.py</w:t>
+        <w:t>Generated by: run_stage1_clean_sdc.py</w:t>
       </w:r>
     </w:p>
     <w:p>
@@ -1945,16 +1937,12 @@
         <w:pStyle w:val="CodeBlock"/>
       </w:pPr>
       <w:r>
-        <w:rPr>
-          <w:rFonts w:ascii="Courier New" w:hAnsi="Courier New" w:eastAsia="Courier New"/>
-          <w:sz w:val="17"/>
-        </w:rPr>
-        <w:t>SDC_PROCESS_VERSION: v2.3.1</w:t>
-      </w:r>
-    </w:p>
-    <w:p>
-      <w:r>
-        <w:t>如果输入文件命中 v2.1+ header signature 或 SDC_PROCESS_VERSION marker，脚本应默认拒绝处理，除非用户显式指定 --force-reprocess。</w:t>
+        <w:t>允许输入: &lt;name&gt;_flatten.sdc generated by run_stage2_merge_delay.tcl</w:t>
+      </w:r>
+    </w:p>
+    <w:p>
+      <w:r>
+        <w:t>顶部 preamble 命中明确的 Stage2 run_stage2_merge_delay.tcl 文件头时，应允许输入；Stage2 flatten SDC 中间拼入的 harden clean SDC 历史 header 不得触发整文件误判。只有输入顶部命中明确的 Stage1 专属 marker 时才默认拒绝，并在 stderr/report 中打印输入路径及命中标记。--force-reprocess 仅用于用户明确希望再次处理 Stage1 输出的特殊情况。</w:t>
       </w:r>
     </w:p>
     <w:p>
@@ -2858,13 +2846,13 @@
     <w:p>
       <w:pPr/>
       <w:r>
-        <w:t>凡 set_false_path、set_multicycle_path、set_case_analysis 直接涉及 harden boundary get_ports，默认不得进入 cleaned harden SDC。set_max_delay / set_min_delay 若两侧都涉及 boundary get_ports，默认不得进入 cleaned harden SDC；若只有一侧是 boundary get_ports、另一侧是 harden 内部对象，则允许执行 single-boundary delay salvage：保留整条 path 约束，将 boundary get_ports 映射为 SoC scope 下的 harden instance get_pins &lt;inst&gt;/&lt;port&gt;，内部对象同步上升 hierarchy，并标记 REVIEW_REQUIRED。该保留用于尽量保持 harden boundary pin 到 harden internal endpoint 的原 path 语义；仍需人工确认其是否属于 cleaned harden SDC，而不是 SoC interface timing。</w:t>
+        <w:t>凡 set_false_path、set_case_analysis 直接涉及 harden boundary get_ports，默认不得进入 cleaned harden SDC。set_multicycle_path 不做 Stage1 删除；若涉及 boundary get_ports，则将 get_ports 映射为 SoC scope 下的 harden instance get_pins &lt;inst&gt;/&lt;port&gt;，其它内部对象同步上升 hierarchy，并标记 REVIEW_REQUIRED。set_max_delay / set_min_delay 不做 Stage1 删除；若 endpoint 涉及 boundary get_ports，则保留整条 path 约束，将 boundary get_ports 映射为 SoC scope 下的 harden instance get_pins &lt;inst&gt;/&lt;port&gt;，其它内部对象同步上升 hierarchy，并标记 REVIEW_REQUIRED。其中 -from get_ports -to get_ports 两端都映射为 instance get_pins 后保留。该保留用于尽量保持 harden boundary pin 相关原 path 语义；仍需人工确认其是否属于 cleaned harden SDC，而不是 SoC interface timing。</w:t>
       </w:r>
     </w:p>
     <w:p>
       <w:pPr/>
       <w:r>
-        <w:t>single-boundary delay salvage 示例：</w:t>
+        <w:t>boundary delay mapping 示例：</w:t>
       </w:r>
     </w:p>
     <w:p>
@@ -2897,6 +2885,46 @@
       </w:pPr>
       <w:r>
         <w:t># cleaned: set_min_delay 0.1 -from [get_pins &lt;inst&gt;/u_src/Q] -to [get_pins &lt;inst&gt;/B]</w:t>
+      </w:r>
+    </w:p>
+    <w:p>
+      <w:pPr>
+        <w:pStyle w:val="CodeBlock"/>
+      </w:pPr>
+      <w:r>
+        <w:t># original: set_max_delay 0.7 -from [get_ports A] -to [get_ports B]</w:t>
+      </w:r>
+    </w:p>
+    <w:p>
+      <w:pPr>
+        <w:pStyle w:val="CodeBlock"/>
+      </w:pPr>
+      <w:r>
+        <w:t># cleaned: set_max_delay 0.7 -from [get_pins &lt;inst&gt;/A] -to [get_pins &lt;inst&gt;/B]</w:t>
+      </w:r>
+    </w:p>
+    <w:p>
+      <w:pPr>
+        <w:pStyle w:val="CodeBlock"/>
+      </w:pPr>
+      <w:r>
+        <w:t>set_multicycle_path boundary mapping 示例：</w:t>
+      </w:r>
+    </w:p>
+    <w:p>
+      <w:pPr>
+        <w:pStyle w:val="CodeBlock"/>
+      </w:pPr>
+      <w:r>
+        <w:t># original: set_multicycle_path 2 -setup -from [get_ports A] -to [get_pins u_dst/D]</w:t>
+      </w:r>
+    </w:p>
+    <w:p>
+      <w:pPr>
+        <w:pStyle w:val="CodeBlock"/>
+      </w:pPr>
+      <w:r>
+        <w:t># cleaned: set_multicycle_path 2 -setup -from [get_pins &lt;inst&gt;/A] -to [get_pins &lt;inst&gt;/u_dst/D]</w:t>
       </w:r>
     </w:p>
     <w:p>
@@ -3191,7 +3219,7 @@
           </w:tcPr>
           <w:p>
             <w:r>
-              <w:t>MODIFY</w:t>
+              <w:t>MODIFY + REVIEW_REQUIRED when boundary get_ports</w:t>
             </w:r>
           </w:p>
         </w:tc>
@@ -3202,7 +3230,7 @@
           </w:tcPr>
           <w:p>
             <w:r>
-              <w:t>保留并映射对象；setup/hold pair 需 review</w:t>
+              <w:t>保留并映射对象；涉及 boundary get_ports 时映射为 instance get_pins；setup/hold pair 需 review</w:t>
             </w:r>
           </w:p>
         </w:tc>
@@ -3226,7 +3254,7 @@
           </w:tcPr>
           <w:p>
             <w:r>
-              <w:t>MODIFY</w:t>
+              <w:t>MODIFY + REVIEW_REQUIRED when boundary get_ports</w:t>
             </w:r>
           </w:p>
         </w:tc>
@@ -3237,7 +3265,7 @@
           </w:tcPr>
           <w:p>
             <w:r>
-              <w:t>涉及 block port 必须 report</w:t>
+              <w:t>保留整条 path 并映射对象；涉及 boundary get_ports 时映射为 instance get_pins，包含 from port to port；需 review</w:t>
             </w:r>
           </w:p>
         </w:tc>
@@ -4230,7 +4258,7 @@
           </w:tcPr>
           <w:p>
             <w:r>
-              <w:t>内部 exception</w:t>
+              <w:t>内部 exception；set_multicycle_path boundary get_ports 映射 + REVIEW_REQUIRED；set_false_path boundary get_ports 移除</w:t>
             </w:r>
           </w:p>
         </w:tc>
@@ -4254,7 +4282,7 @@
           </w:tcPr>
           <w:p>
             <w:r>
-              <w:t>MODIFY</w:t>
+              <w:t>MODIFY + REVIEW_REQUIRED when boundary get_ports</w:t>
             </w:r>
           </w:p>
         </w:tc>
@@ -4265,7 +4293,7 @@
           </w:tcPr>
           <w:p>
             <w:r>
-              <w:t>port endpoint report</w:t>
+              <w:t>保留整条 path 并映射对象；涉及 boundary get_ports 时映射为 instance get_pins，包含 from port to port；需 review</w:t>
             </w:r>
           </w:p>
         </w:tc>
@@ -4718,7 +4746,7 @@
     <w:p>
       <w:pPr/>
       <w:r>
-        <w:t>主 SDC 中 review_required=True 的 KEEP/MODIFY 命令虽然可由 SoC STA source，但必须人工优先复核。脚本必须将这类命令输出到独立醒目区块中；这些命令不得在普通 body 中重复输出。为保证 source 顺序安全，进入主 SDC 的 clock definition 必须先于 REVIEW_REQUIRED 区块输出。直接涉及 harden boundary get_ports 的 path/mode 约束不进入该区块，而是进入 removed.sdc。</w:t>
+        <w:t>主 SDC 中 review_required=True 的 KEEP/MODIFY 命令虽然可由 SoC STA source，但必须人工优先复核。脚本必须将这类命令输出到独立醒目区块中；这些命令不得在普通 body 中重复输出。为保证 source 顺序安全，进入主 SDC 的 clock definition 必须先于 REVIEW_REQUIRED 区块输出。直接涉及 harden boundary get_ports 的 set_false_path / set_case_analysis 不进入该区块，而是进入 removed.sdc；set_multicycle_path 涉及 boundary get_ports 时映射为 instance get_pins 后进入 REVIEW_REQUIRED 区块。</w:t>
       </w:r>
     </w:p>
     <w:p>
@@ -5666,7 +5694,7 @@
           <w:rFonts w:ascii="Courier New" w:hAnsi="Courier New" w:eastAsia="Courier New"/>
           <w:sz w:val="17"/>
         </w:rPr>
-        <w:t># Generated by        : proc_harden_sdc.py</w:t>
+        <w:t># Generated by        : run_stage1_clean_sdc.py</w:t>
       </w:r>
     </w:p>
     <w:p>
@@ -5988,7 +6016,7 @@
         <w:pStyle w:val="ListNumber"/>
       </w:pPr>
       <w:r>
-        <w:t>boundary get_ports path/mode 约束是否已移出 cleaned harden SDC；set_max_delay/set_min_delay 单边 boundary salvage 是否将 boundary get_ports 映射为 instance get_pins、内部对象同步上升 hierarchy、保留整条 path 并标记 REVIEW_REQUIRED；其余是否转交 scenario pre、10/20/30 或 SoC 级 review；</w:t>
+        <w:t>boundary get_ports 的 set_false_path / set_case_analysis 是否已移出 cleaned harden SDC；set_multicycle_path 涉及 boundary get_ports 时是否映射为 instance get_pins、内部对象同步上升 hierarchy 并标记 REVIEW_REQUIRED；set_max_delay/set_min_delay 涉及 boundary get_ports 时是否将 boundary get_ports 映射为 instance get_pins、内部对象同步上升 hierarchy、保留整条 path 并标记 REVIEW_REQUIRED，包含 -from get_ports -to get_ports；其余是否转交 scenario pre、10/20/30 或 SoC 级 review；</w:t>
       </w:r>
     </w:p>
     <w:p>
@@ -6221,7 +6249,7 @@
         <w:pStyle w:val="ListNumber"/>
       </w:pPr>
       <w:r>
-        <w:t>主 SDC 只输出 KEEP / MODIFY 后命令；clock definition 必须先于 REVIEW_REQUIRED 区块；review_required=True 的可 source 命令进入 REVIEW_REQUIRED 顶部区块，不能在普通 body 中重复输出；boundary get_ports path/mode 约束默认不进入主 SDC，但 set_max_delay/set_min_delay 单边 boundary salvage 会将 boundary get_ports 映射为 instance get_pins，保留整条 path 并进入 REVIEW_REQUIRED。</w:t>
+        <w:t>主 SDC 只输出 KEEP / MODIFY 后命令；clock definition 必须先于 REVIEW_REQUIRED 区块；review_required=True 的可 source 命令进入 REVIEW_REQUIRED 顶部区块，不能在普通 body 中重复输出；boundary get_ports 的 set_false_path / set_case_analysis 默认不进入主 SDC；set_multicycle_path 涉及 boundary get_ports 时映射为 instance get_pins 后进入 REVIEW_REQUIRED；set_max_delay/set_min_delay 涉及 boundary get_ports 时映射为 instance get_pins，保留整条 path 并进入 REVIEW_REQUIRED，包含 -from get_ports -to get_ports。</w:t>
       </w:r>
     </w:p>
     <w:p>
@@ -6355,7 +6383,7 @@
     <w:p>
       <w:pPr/>
       <w:r>
-        <w:t>Boundary get_ports path/mode constraints default policy: set_false_path / set_multicycle_path / set_case_analysis 只要直接涉及 harden boundary get_ports，就从 cleaned harden SDC 移除；set_max_delay / set_min_delay 两侧都是 boundary get_ports 时移除，单边 boundary + 单边内部对象时将 get_ports 映射为 instance get_pins，内部对象同步上升 hierarchy，保留整条 path 并标记 REVIEW_REQUIRED。</w:t>
+        <w:t>Boundary get_ports path/mode constraints default policy: set_false_path / set_case_analysis 只要直接涉及 harden boundary get_ports，就从 cleaned harden SDC 移除；set_multicycle_path 涉及 boundary get_ports 时保留并映射为 instance get_pins，内部对象同步上升 hierarchy，并标记 REVIEW_REQUIRED；set_max_delay / set_min_delay 涉及 boundary get_ports 时保留并映射为 instance get_pins，内部对象同步上升 hierarchy，保留整条 path 并标记 REVIEW_REQUIRED，包含 -from get_ports -to get_ports。</w:t>
       </w:r>
     </w:p>
     <w:p>

</xml_diff>